<commit_message>
Refocus portfolio and CV on WordPress, JS, HTML, and AI Automations
</commit_message>
<xml_diff>
--- a/Estefania_Moncada_Resume.docx
+++ b/Estefania_Moncada_Resume.docx
@@ -33,7 +33,7 @@
           <w:sz w:val="24"/>
           <w:szCs w:val="24"/>
         </w:rPr>
-        <w:t xml:space="preserve">Full Stack Developer &amp; AI Automation Specialist</w:t>
+        <w:t xml:space="preserve">WordPress, JS/HTML &amp; AI Automation Specialist</w:t>
       </w:r>
     </w:p>
     <w:p>
@@ -180,7 +180,7 @@
           <w:sz w:val="20"/>
           <w:szCs w:val="20"/>
         </w:rPr>
-        <w:t xml:space="preserve">Results-driven Full Stack Developer and AI Automation Specialist with a strong track record of building Progressive Web Applications (PWAs) from scratch, designing smart automation workflows, and creating high-performance custom WordPress themes. Expert in integrating AI agents to streamline business processes and optimizing web performance. Experienced in working remotely and collaborating in agile environments to deliver robust web solutions.</w:t>
+        <w:t xml:space="preserve">Results-driven WordPress Developer and AI Automation Specialist with a strong track record of building high-performance custom WordPress themes, designing smart workflows with N8N/Claude, and developing custom Full Stack web applications. Expert in JavaScript, HTML5, PHP, and integrating AI agents to streamline business processes. Experienced in working remotely and delivering robust web and automation solutions.</w:t>
       </w:r>
     </w:p>
     <w:p>
@@ -221,16 +221,16 @@
           <w:sz w:val="20"/>
           <w:szCs w:val="20"/>
         </w:rPr>
-        <w:t xml:space="preserve">AI &amp; Automation: </w:t>
-      </w:r>
-      <w:r>
-        <w:rPr>
-          <w:rFonts w:ascii="Arial" w:cs="Arial" w:eastAsia="Arial" w:hAnsi="Arial"/>
-          <w:color w:val="1E293B"/>
-          <w:sz w:val="20"/>
-          <w:szCs w:val="20"/>
-        </w:rPr>
-        <w:t xml:space="preserve">n8n, Claude AI, OpenAI API, custom API integrations, webhooks, workflow automation.</w:t>
+        <w:t xml:space="preserve">WordPress &amp; Web Core: </w:t>
+      </w:r>
+      <w:r>
+        <w:rPr>
+          <w:rFonts w:ascii="Arial" w:cs="Arial" w:eastAsia="Arial" w:hAnsi="Arial"/>
+          <w:color w:val="1E293B"/>
+          <w:sz w:val="20"/>
+          <w:szCs w:val="20"/>
+        </w:rPr>
+        <w:t xml:space="preserve">Custom WordPress themes (PHP/JS/HTML), WordPress Core, WooCommerce, JavaScript (ES6+), HTML5, CSS3, TailwindCSS, Shopify, Wix, SEO.</w:t>
       </w:r>
     </w:p>
     <w:p>
@@ -251,46 +251,16 @@
           <w:sz w:val="20"/>
           <w:szCs w:val="20"/>
         </w:rPr>
-        <w:t xml:space="preserve">Frontend Development: </w:t>
-      </w:r>
-      <w:r>
-        <w:rPr>
-          <w:rFonts w:ascii="Arial" w:cs="Arial" w:eastAsia="Arial" w:hAnsi="Arial"/>
-          <w:color w:val="1E293B"/>
-          <w:sz w:val="20"/>
-          <w:szCs w:val="20"/>
-        </w:rPr>
-        <w:t xml:space="preserve">React.js, Vite, Progressive Web Apps (PWAs), Service Workers, HTML5, CSS3, TailwindCSS.</w:t>
-      </w:r>
-    </w:p>
-    <w:p>
-      <w:pPr>
-        <w:pStyle w:val="ListParagraph"/>
-        <w:numPr>
-          <w:ilvl w:val="0"/>
-          <w:numId w:val="1"/>
-        </w:numPr>
-        <w:spacing w:after="40" w:before="40"/>
-      </w:pPr>
-      <w:r>
-        <w:rPr>
-          <w:rFonts w:ascii="Arial" w:cs="Arial" w:eastAsia="Arial" w:hAnsi="Arial"/>
-          <w:b/>
-          <w:bCs/>
-          <w:color w:val="1E293B"/>
-          <w:sz w:val="20"/>
-          <w:szCs w:val="20"/>
-        </w:rPr>
-        <w:t xml:space="preserve">Backend Development &amp; CMS: </w:t>
-      </w:r>
-      <w:r>
-        <w:rPr>
-          <w:rFonts w:ascii="Arial" w:cs="Arial" w:eastAsia="Arial" w:hAnsi="Arial"/>
-          <w:color w:val="1E293B"/>
-          <w:sz w:val="20"/>
-          <w:szCs w:val="20"/>
-        </w:rPr>
-        <w:t xml:space="preserve">Node.js, Express, PHP, custom WordPress themes (without heavy builders), Shopify.</w:t>
+        <w:t xml:space="preserve">AI &amp; Automation Solutions: </w:t>
+      </w:r>
+      <w:r>
+        <w:rPr>
+          <w:rFonts w:ascii="Arial" w:cs="Arial" w:eastAsia="Arial" w:hAnsi="Arial"/>
+          <w:color w:val="1E293B"/>
+          <w:sz w:val="20"/>
+          <w:szCs w:val="20"/>
+        </w:rPr>
+        <w:t xml:space="preserve">N8N workflow design, Claude AI, OpenAI API, REST APIs, Webhooks, Zapier automation, custom AI integrations.</w:t>
       </w:r>
     </w:p>
     <w:p>
@@ -311,16 +281,16 @@
           <w:sz w:val="20"/>
           <w:szCs w:val="20"/>
         </w:rPr>
-        <w:t xml:space="preserve">Databases, Tools &amp; Standards: </w:t>
-      </w:r>
-      <w:r>
-        <w:rPr>
-          <w:rFonts w:ascii="Arial" w:cs="Arial" w:eastAsia="Arial" w:hAnsi="Arial"/>
-          <w:color w:val="1E293B"/>
-          <w:sz w:val="20"/>
-          <w:szCs w:val="20"/>
-        </w:rPr>
-        <w:t xml:space="preserve">MySQL, PostgreSQL, MongoDB, Sequelize ORM, JWT authentication, Postman API testing, Git/GitHub, SEO optimization, offline-first design.</w:t>
+        <w:t xml:space="preserve">Full Stack &amp; Web Tools: </w:t>
+      </w:r>
+      <w:r>
+        <w:rPr>
+          <w:rFonts w:ascii="Arial" w:cs="Arial" w:eastAsia="Arial" w:hAnsi="Arial"/>
+          <w:color w:val="1E293B"/>
+          <w:sz w:val="20"/>
+          <w:szCs w:val="20"/>
+        </w:rPr>
+        <w:t xml:space="preserve">React.js, Node.js, Express, MySQL, MongoDB, Sequelize ORM, JWT, Postman API testing, Git/GitHub, Progressive Web Apps (PWAs) as secondary expertise.</w:t>
       </w:r>
     </w:p>
     <w:p>
@@ -356,16 +326,16 @@
           <w:sz w:val="22"/>
           <w:szCs w:val="22"/>
         </w:rPr>
-        <w:t xml:space="preserve">Smart Workflows &amp; Automations </w:t>
-      </w:r>
-      <w:r>
-        <w:rPr>
-          <w:rFonts w:ascii="Arial" w:cs="Arial" w:eastAsia="Arial" w:hAnsi="Arial"/>
-          <w:color w:val="475569"/>
-          <w:sz w:val="20"/>
-          <w:szCs w:val="20"/>
-        </w:rPr>
-        <w:t xml:space="preserve">(n8n, Claude AI, APIs, Node.js)</w:t>
+        <w:t xml:space="preserve">Pilates Theme - Custom WordPress </w:t>
+      </w:r>
+      <w:r>
+        <w:rPr>
+          <w:rFonts w:ascii="Arial" w:cs="Arial" w:eastAsia="Arial" w:hAnsi="Arial"/>
+          <w:color w:val="475569"/>
+          <w:sz w:val="20"/>
+          <w:szCs w:val="20"/>
+        </w:rPr>
+        <w:t xml:space="preserve">(PHP, WordPress Core, JavaScript, HTML5, CSS3)</w:t>
       </w:r>
     </w:p>
     <w:p>
@@ -384,7 +354,7 @@
           <w:sz w:val="20"/>
           <w:szCs w:val="20"/>
         </w:rPr>
-        <w:t xml:space="preserve">Designed and implemented end-to-end intelligent automation workflows connecting multiple business tools via REST APIs and webhooks.</w:t>
+        <w:t xml:space="preserve">Developed a lightweight, fully customized WordPress theme from scratch without reliance on heavy visual builders.</w:t>
       </w:r>
     </w:p>
     <w:p>
@@ -403,7 +373,7 @@
           <w:sz w:val="20"/>
           <w:szCs w:val="20"/>
         </w:rPr>
-        <w:t xml:space="preserve">Integrated LLMs (Claude AI) to automate content categorization, notification delivery, and moderate inquiries, saving clients hundreds of hours of manual operations.</w:t>
+        <w:t xml:space="preserve">Optimized theme performance to guarantee ultra-fast loading speeds, achieving superior Lighthouse scores and improved SEO rankings.</w:t>
       </w:r>
     </w:p>
     <w:p>
@@ -419,16 +389,16 @@
           <w:sz w:val="22"/>
           <w:szCs w:val="22"/>
         </w:rPr>
-        <w:t xml:space="preserve">Virtual School for Artists &amp; Entrepreneurs </w:t>
-      </w:r>
-      <w:r>
-        <w:rPr>
-          <w:rFonts w:ascii="Arial" w:cs="Arial" w:eastAsia="Arial" w:hAnsi="Arial"/>
-          <w:color w:val="475569"/>
-          <w:sz w:val="20"/>
-          <w:szCs w:val="20"/>
-        </w:rPr>
-        <w:t xml:space="preserve">(React.js, Vite, Node.js, MySQL)</w:t>
+        <w:t xml:space="preserve">Smart Workflows &amp; Automations </w:t>
+      </w:r>
+      <w:r>
+        <w:rPr>
+          <w:rFonts w:ascii="Arial" w:cs="Arial" w:eastAsia="Arial" w:hAnsi="Arial"/>
+          <w:color w:val="475569"/>
+          <w:sz w:val="20"/>
+          <w:szCs w:val="20"/>
+        </w:rPr>
+        <w:t xml:space="preserve">(n8n, Claude AI, APIs, Node.js)</w:t>
       </w:r>
     </w:p>
     <w:p>
@@ -447,7 +417,7 @@
           <w:sz w:val="20"/>
           <w:szCs w:val="20"/>
         </w:rPr>
-        <w:t xml:space="preserve">Developed a full-stack e-learning platform featuring an integrated shopping cart, administrative course management panel, and manual/automatic payment verification pipelines.</w:t>
+        <w:t xml:space="preserve">Designed and implemented end-to-end intelligent automation workflows connecting multiple business tools via REST APIs and webhooks.</w:t>
       </w:r>
     </w:p>
     <w:p>
@@ -466,7 +436,7 @@
           <w:sz w:val="20"/>
           <w:szCs w:val="20"/>
         </w:rPr>
-        <w:t xml:space="preserve">Utilized Sequelize ORM to design secure database schemas and REST APIs for course content delivery.</w:t>
+        <w:t xml:space="preserve">Integrated LLMs (Claude AI) to automate content categorization, notification delivery, and moderate inquiries, saving clients hundreds of hours of manual operations.</w:t>
       </w:r>
     </w:p>
     <w:p>
@@ -482,16 +452,16 @@
           <w:sz w:val="22"/>
           <w:szCs w:val="22"/>
         </w:rPr>
-        <w:t xml:space="preserve">Deja tu Huella Management Platform </w:t>
-      </w:r>
-      <w:r>
-        <w:rPr>
-          <w:rFonts w:ascii="Arial" w:cs="Arial" w:eastAsia="Arial" w:hAnsi="Arial"/>
-          <w:color w:val="475569"/>
-          <w:sz w:val="20"/>
-          <w:szCs w:val="20"/>
-        </w:rPr>
-        <w:t xml:space="preserve">(React.js, MongoDB, Node.js, JWT)</w:t>
+        <w:t xml:space="preserve">Virtual School for Artists &amp; Entrepreneurs </w:t>
+      </w:r>
+      <w:r>
+        <w:rPr>
+          <w:rFonts w:ascii="Arial" w:cs="Arial" w:eastAsia="Arial" w:hAnsi="Arial"/>
+          <w:color w:val="475569"/>
+          <w:sz w:val="20"/>
+          <w:szCs w:val="20"/>
+        </w:rPr>
+        <w:t xml:space="preserve">(React.js, Vite, Node.js, MySQL)</w:t>
       </w:r>
     </w:p>
     <w:p>
@@ -510,7 +480,7 @@
           <w:sz w:val="20"/>
           <w:szCs w:val="20"/>
         </w:rPr>
-        <w:t xml:space="preserve">Built a secure management platform utilizing the MERN stack with token-based authentication (JWT) for secure user sessions and route protection.</w:t>
+        <w:t xml:space="preserve">Developed a full-stack e-learning platform featuring an integrated shopping cart, administrative course management panel, and manual/automatic payment verification pipelines.</w:t>
       </w:r>
     </w:p>
     <w:p>
@@ -529,7 +499,7 @@
           <w:sz w:val="20"/>
           <w:szCs w:val="20"/>
         </w:rPr>
-        <w:t xml:space="preserve">Designed and tested the complete API suite using Postman, ensuring robust request validation and error handling.</w:t>
+        <w:t xml:space="preserve">Utilized Sequelize ORM to design database schemas and REST APIs. Built with an AI-guided development approach.</w:t>
       </w:r>
     </w:p>
     <w:p>
@@ -545,16 +515,16 @@
           <w:sz w:val="22"/>
           <w:szCs w:val="22"/>
         </w:rPr>
-        <w:t xml:space="preserve">Pilates Theme - Custom WordPress </w:t>
-      </w:r>
-      <w:r>
-        <w:rPr>
-          <w:rFonts w:ascii="Arial" w:cs="Arial" w:eastAsia="Arial" w:hAnsi="Arial"/>
-          <w:color w:val="475569"/>
-          <w:sz w:val="20"/>
-          <w:szCs w:val="20"/>
-        </w:rPr>
-        <w:t xml:space="preserve">(PHP, WordPress Core, JavaScript, CSS3)</w:t>
+        <w:t xml:space="preserve">Deja tu Huella Management Platform </w:t>
+      </w:r>
+      <w:r>
+        <w:rPr>
+          <w:rFonts w:ascii="Arial" w:cs="Arial" w:eastAsia="Arial" w:hAnsi="Arial"/>
+          <w:color w:val="475569"/>
+          <w:sz w:val="20"/>
+          <w:szCs w:val="20"/>
+        </w:rPr>
+        <w:t xml:space="preserve">(React.js, MongoDB, Node.js, JWT)</w:t>
       </w:r>
     </w:p>
     <w:p>
@@ -573,7 +543,7 @@
           <w:sz w:val="20"/>
           <w:szCs w:val="20"/>
         </w:rPr>
-        <w:t xml:space="preserve">Developed a lightweight, fully customized WordPress theme from scratch without bloat or dependency on heavy visual builders.</w:t>
+        <w:t xml:space="preserve">Built a secure management platform utilizing the MERN stack with token-based authentication (JWT) for secure user sessions and route protection.</w:t>
       </w:r>
     </w:p>
     <w:p>
@@ -592,7 +562,7 @@
           <w:sz w:val="20"/>
           <w:szCs w:val="20"/>
         </w:rPr>
-        <w:t xml:space="preserve">Optimized theme performance to guarantee ultra-fast loading speeds, achieving superior Lighthouse scores and improved SEO rankings.</w:t>
+        <w:t xml:space="preserve">Designed and tested the complete API suite using Postman, ensuring robust request validation and error handling.</w:t>
       </w:r>
     </w:p>
     <w:p>
@@ -608,16 +578,16 @@
           <w:sz w:val="22"/>
           <w:szCs w:val="22"/>
         </w:rPr>
-        <w:t xml:space="preserve">AI-Powered Progressive Web Apps (PWAs) </w:t>
-      </w:r>
-      <w:r>
-        <w:rPr>
-          <w:rFonts w:ascii="Arial" w:cs="Arial" w:eastAsia="Arial" w:hAnsi="Arial"/>
-          <w:color w:val="475569"/>
-          <w:sz w:val="20"/>
-          <w:szCs w:val="20"/>
-        </w:rPr>
-        <w:t xml:space="preserve">(React.js, Service Workers, Claude API)</w:t>
+        <w:t xml:space="preserve">Mobile Web &amp; AI Chat Integrations </w:t>
+      </w:r>
+      <w:r>
+        <w:rPr>
+          <w:rFonts w:ascii="Arial" w:cs="Arial" w:eastAsia="Arial" w:hAnsi="Arial"/>
+          <w:color w:val="475569"/>
+          <w:sz w:val="20"/>
+          <w:szCs w:val="20"/>
+        </w:rPr>
+        <w:t xml:space="preserve">(JavaScript, HTML5, CSS3, Claude API)</w:t>
       </w:r>
     </w:p>
     <w:p>
@@ -636,7 +606,7 @@
           <w:sz w:val="20"/>
           <w:szCs w:val="20"/>
         </w:rPr>
-        <w:t xml:space="preserve">Designed offline-first mobile PWAs from scratch with Service Workers to support reliable caching and offline access.</w:t>
+        <w:t xml:space="preserve">Designed and developed modern, mobile-responsive web interfaces integrated with intelligent AI agents using custom JavaScript.</w:t>
       </w:r>
     </w:p>
     <w:p>
@@ -655,7 +625,7 @@
           <w:sz w:val="20"/>
           <w:szCs w:val="20"/>
         </w:rPr>
-        <w:t xml:space="preserve">Integrated intelligent chat interfaces and offline synchronization pipelines, delivering a fluid, native application experience on both iOS and Android.</w:t>
+        <w:t xml:space="preserve">Leveraged Service Workers for offline caching and offline capabilities, delivering fluid experiences for mobile web users.</w:t>
       </w:r>
     </w:p>
     <w:p>
@@ -691,7 +661,7 @@
           <w:sz w:val="22"/>
           <w:szCs w:val="22"/>
         </w:rPr>
-        <w:t xml:space="preserve">Freelance Full Stack Developer &amp; Automation Consultant</w:t>
+        <w:t xml:space="preserve">Freelance WordPress Developer &amp; Automation Consultant</w:t>
       </w:r>
     </w:p>
     <w:p>
@@ -724,7 +694,7 @@
           <w:sz w:val="20"/>
           <w:szCs w:val="20"/>
         </w:rPr>
-        <w:t xml:space="preserve">Consulted on and built custom web platforms for diverse international clients, including corporate pages and tailored e-commerce solutions (such as Isa Bermúdez, FreyWater, Hope Studios, and Mental Health Series).</w:t>
+        <w:t xml:space="preserve">Built and optimized custom WordPress/WooCommerce websites for diverse international clients (such as Isa Bermúdez, FreyWater, Hope Studios, and Mental Health Series), improving page-speed and SEO performance.</w:t>
       </w:r>
     </w:p>
     <w:p>
@@ -743,7 +713,7 @@
           <w:sz w:val="20"/>
           <w:szCs w:val="20"/>
         </w:rPr>
-        <w:t xml:space="preserve">Designed custom automation architectures using n8n and Claude AI, significantly cutting manual operational overhead for business operations.</w:t>
+        <w:t xml:space="preserve">Designed and implemented custom AI solutions and workflow automations (using N8N and Claude AI), reducing manual operational overhead for business operations.</w:t>
       </w:r>
     </w:p>
     <w:p>
@@ -762,7 +732,7 @@
           <w:sz w:val="20"/>
           <w:szCs w:val="20"/>
         </w:rPr>
-        <w:t xml:space="preserve">Built and optimized custom WordPress/WooCommerce and Shopify themes, improving conversion rates by up to 20% through page-speed and layout optimization.</w:t>
+        <w:t xml:space="preserve">Developed custom HTML5, CSS3, and JavaScript front-end components and full stack web solutions to drive conversion and digital engagement.</w:t>
       </w:r>
     </w:p>
     <w:p>

</xml_diff>

<commit_message>
Add Postgres, React JS, Next JS, and PHP to focus text and resume profile summary
</commit_message>
<xml_diff>
--- a/Estefania_Moncada_Resume.docx
+++ b/Estefania_Moncada_Resume.docx
@@ -180,7 +180,7 @@
           <w:sz w:val="20"/>
           <w:szCs w:val="20"/>
         </w:rPr>
-        <w:t xml:space="preserve">Results-driven WordPress Developer and AI Automation Specialist with a strong track record of building high-performance custom WordPress themes, designing smart workflows with N8N/Claude, and developing custom Full Stack web applications. Expert in JavaScript, HTML5, PHP, and integrating AI agents to streamline business processes. Experienced in working remotely and delivering robust web and automation solutions.</w:t>
+        <w:t xml:space="preserve">Results-driven WordPress Developer and AI Automation Specialist with a strong track record of building high-performance custom WordPress themes, designing smart workflows with N8N/Claude, and developing custom Full Stack web applications. Expert in JavaScript, HTML5, React JS, Next JS, PHP, Postgres, and integrating AI agents to streamline business processes. Experienced in working remotely and delivering robust web and automation solutions.</w:t>
       </w:r>
     </w:p>
     <w:p>
@@ -290,7 +290,7 @@
           <w:sz w:val="20"/>
           <w:szCs w:val="20"/>
         </w:rPr>
-        <w:t xml:space="preserve">React.js, Node.js, Express, MySQL, MongoDB, Sequelize ORM, JWT, Postman API testing, Git/GitHub, Progressive Web Apps (PWAs) as secondary expertise.</w:t>
+        <w:t xml:space="preserve">React JS, Next JS, PHP, Postgres, Node.js, Express, MySQL, MongoDB, Sequelize ORM, JWT, Postman API testing, Git/GitHub, Progressive Web Apps (PWAs) as secondary expertise.</w:t>
       </w:r>
     </w:p>
     <w:p>
@@ -354,7 +354,7 @@
           <w:sz w:val="20"/>
           <w:szCs w:val="20"/>
         </w:rPr>
-        <w:t xml:space="preserve">Developed a lightweight, fully customized WordPress theme from scratch without reliance on heavy visual builders.</w:t>
+        <w:t xml:space="preserve">Developed a lightweight, fully customized WordPress theme from scratch using PHP, JavaScript, and HTML, avoiding bloated visual builders.</w:t>
       </w:r>
     </w:p>
     <w:p>
@@ -694,7 +694,7 @@
           <w:sz w:val="20"/>
           <w:szCs w:val="20"/>
         </w:rPr>
-        <w:t xml:space="preserve">Built and optimized custom WordPress/WooCommerce websites for diverse international clients (such as Isa Bermúdez, FreyWater, Hope Studios, and Mental Health Series), improving page-speed and SEO performance.</w:t>
+        <w:t xml:space="preserve">Built and optimized custom WordPress/WooCommerce websites using PHP, JavaScript, React JS, Next JS, Postgres, and HTML/CSS for international clients.</w:t>
       </w:r>
     </w:p>
     <w:p>

</xml_diff>